<commit_message>
Automatic project set-up: new NetSuite job + SharePoint folder -> Projects row, forecast lines replicating the costing, labour, contract, Smartsheet folder; runs in the daily 07:30 task; SOP start-up section rewritten as one path
Co-Authored-By: Claude Opus 5.5 <noreply@anthropic.com>
</commit_message>
<xml_diff>
--- a/docs/BHF Project Cashflow SOP.docx
+++ b/docs/BHF Project Cashflow SOP.docx
@@ -888,7 +888,7 @@
                 <w:color w:val="222222"/>
                 <w:sz w:val="17"/>
               </w:rPr>
-              <w:t>Sets the project up (section 4); keeps forecast lines, expected dates and customer milestones right; clears Needs attention weekly; sets the P&amp;L timeline.</w:t>
+              <w:t>Creates the SharePoint folder and saves the costing at award (section 4); checks the set-up; keeps forecast lines, expected dates and customer milestones right; clears Needs attention weekly; sets the P&amp;L timeline.</w:t>
             </w:r>
           </w:p>
         </w:tc>
@@ -1081,7 +1081,7 @@
           <w:color w:val="16324F"/>
           <w:sz w:val="26"/>
         </w:rPr>
-        <w:t>4.  Starting a project (the only way in)</w:t>
+        <w:t>4.  Starting a project (one way in)</w:t>
       </w:r>
     </w:p>
     <w:p>
@@ -1096,232 +1096,7 @@
           <w:color w:val="222222"/>
           <w:sz w:val="21"/>
         </w:rPr>
-        <w:t>A project starts when an enquiry is won. It is set up on the app within two working days of the customer PO.</w:t>
-      </w:r>
-    </w:p>
-    <w:p>
-      <w:pPr>
-        <w:spacing w:before="0" w:after="60" w:line="250" w:lineRule="auto"/>
-        <w:pStyle w:val="ListParagraph"/>
-        <w:numPr>
-          <w:ilvl w:val="0"/>
-          <w:numId w:val="3"/>
-        </w:numPr>
-      </w:pPr>
-      <w:r>
-        <w:rPr>
-          <w:rFonts w:ascii="Aptos" w:hAnsi="Aptos" w:cs="Aptos"/>
-          <w:b/>
-          <w:i w:val="0"/>
-          <w:color w:val="222222"/>
-          <w:sz w:val="21"/>
-        </w:rPr>
-        <w:t>NetSuite job:</w:t>
-      </w:r>
-      <w:r>
-        <w:rPr>
-          <w:rFonts w:ascii="Aptos" w:hAnsi="Aptos" w:cs="Aptos"/>
-          <w:b w:val="0"/>
-          <w:i w:val="0"/>
-          <w:color w:val="222222"/>
-          <w:sz w:val="21"/>
-        </w:rPr>
-        <w:t xml:space="preserve"> accounts create the job (customer:job) in NetSuite and give the PM the job's internal ID (in the job's URL, id=12345). If the customer is new, accounts also create its Unearned Income (21xx) and Project WIP (115x) accounts.</w:t>
-      </w:r>
-    </w:p>
-    <w:p>
-      <w:pPr>
-        <w:spacing w:before="0" w:after="60" w:line="250" w:lineRule="auto"/>
-        <w:pStyle w:val="ListParagraph"/>
-        <w:numPr>
-          <w:ilvl w:val="0"/>
-          <w:numId w:val="3"/>
-        </w:numPr>
-      </w:pPr>
-      <w:r>
-        <w:rPr>
-          <w:rFonts w:ascii="Aptos" w:hAnsi="Aptos" w:cs="Aptos"/>
-          <w:b/>
-          <w:i w:val="0"/>
-          <w:color w:val="222222"/>
-          <w:sz w:val="21"/>
-        </w:rPr>
-        <w:t>Folders:</w:t>
-      </w:r>
-      <w:r>
-        <w:rPr>
-          <w:rFonts w:ascii="Aptos" w:hAnsi="Aptos" w:cs="Aptos"/>
-          <w:b w:val="0"/>
-          <w:i w:val="0"/>
-          <w:color w:val="222222"/>
-          <w:sz w:val="21"/>
-        </w:rPr>
-        <w:t xml:space="preserve"> copy the "BHF Project Contracted Template" folder in Smartsheet (3. BHF Systems / 2. Contracted) and name it "{code} {project name}". Create the SharePoint project folder from the standard template (it must contain 1.0 Working Folder / 0.7 Requisitions and PO's).</w:t>
-      </w:r>
-    </w:p>
-    <w:p>
-      <w:pPr>
-        <w:spacing w:before="0" w:after="60" w:line="250" w:lineRule="auto"/>
-        <w:pStyle w:val="ListParagraph"/>
-        <w:numPr>
-          <w:ilvl w:val="0"/>
-          <w:numId w:val="3"/>
-        </w:numPr>
-      </w:pPr>
-      <w:r>
-        <w:rPr>
-          <w:rFonts w:ascii="Aptos" w:hAnsi="Aptos" w:cs="Aptos"/>
-          <w:b/>
-          <w:i w:val="0"/>
-          <w:color w:val="222222"/>
-          <w:sz w:val="21"/>
-        </w:rPr>
-        <w:t>Projects sheet:</w:t>
-      </w:r>
-      <w:r>
-        <w:rPr>
-          <w:rFonts w:ascii="Aptos" w:hAnsi="Aptos" w:cs="Aptos"/>
-          <w:b w:val="0"/>
-          <w:i w:val="0"/>
-          <w:color w:val="222222"/>
-          <w:sz w:val="21"/>
-        </w:rPr>
-        <w:t xml:space="preserve"> add one row to the Projects sheet: Project code, Name, NetSuite Job ID, Status Live, Contract Value (ex GST), Internal Labour (BHF labour from the costing), PM, SharePoint Folder (path inside 6.0 Projects - Documents), Unearned Acct ID and WIP Acct ID.</w:t>
-      </w:r>
-    </w:p>
-    <w:p>
-      <w:pPr>
-        <w:spacing w:before="0" w:after="60" w:line="250" w:lineRule="auto"/>
-        <w:pStyle w:val="ListParagraph"/>
-        <w:numPr>
-          <w:ilvl w:val="0"/>
-          <w:numId w:val="3"/>
-        </w:numPr>
-      </w:pPr>
-      <w:r>
-        <w:rPr>
-          <w:rFonts w:ascii="Aptos" w:hAnsi="Aptos" w:cs="Aptos"/>
-          <w:b/>
-          <w:i w:val="0"/>
-          <w:color w:val="222222"/>
-          <w:sz w:val="21"/>
-        </w:rPr>
-        <w:t>Forecast lines:</w:t>
-      </w:r>
-      <w:r>
-        <w:rPr>
-          <w:rFonts w:ascii="Aptos" w:hAnsi="Aptos" w:cs="Aptos"/>
-          <w:b w:val="0"/>
-          <w:i w:val="0"/>
-          <w:color w:val="222222"/>
-          <w:sz w:val="21"/>
-        </w:rPr>
-        <w:t xml:space="preserve"> from the latest costing (1.0 Working Folder / 0.3 Costing &amp; Cashflow, the live costing tab), add the forecast lines: see the mapping table below. Use the dashboard (Forecast &amp; payments) or the project's cashflow sheet.</w:t>
-      </w:r>
-    </w:p>
-    <w:p>
-      <w:pPr>
-        <w:spacing w:before="0" w:after="60" w:line="250" w:lineRule="auto"/>
-        <w:pStyle w:val="ListParagraph"/>
-        <w:numPr>
-          <w:ilvl w:val="0"/>
-          <w:numId w:val="3"/>
-        </w:numPr>
-      </w:pPr>
-      <w:r>
-        <w:rPr>
-          <w:rFonts w:ascii="Aptos" w:hAnsi="Aptos" w:cs="Aptos"/>
-          <w:b/>
-          <w:i w:val="0"/>
-          <w:color w:val="222222"/>
-          <w:sz w:val="21"/>
-        </w:rPr>
-        <w:t>Customer milestones:</w:t>
-      </w:r>
-      <w:r>
-        <w:rPr>
-          <w:rFonts w:ascii="Aptos" w:hAnsi="Aptos" w:cs="Aptos"/>
-          <w:b w:val="0"/>
-          <w:i w:val="0"/>
-          <w:color w:val="222222"/>
-          <w:sz w:val="21"/>
-        </w:rPr>
-        <w:t xml:space="preserve"> add the customer payment milestones (%, amount, expected date) on the incoming line, from the offer or customer PO. They must add up to 100%.</w:t>
-      </w:r>
-    </w:p>
-    <w:p>
-      <w:pPr>
-        <w:spacing w:before="0" w:after="60" w:line="250" w:lineRule="auto"/>
-        <w:pStyle w:val="ListParagraph"/>
-        <w:numPr>
-          <w:ilvl w:val="0"/>
-          <w:numId w:val="3"/>
-        </w:numPr>
-      </w:pPr>
-      <w:r>
-        <w:rPr>
-          <w:rFonts w:ascii="Aptos" w:hAnsi="Aptos" w:cs="Aptos"/>
-          <w:b/>
-          <w:i w:val="0"/>
-          <w:color w:val="222222"/>
-          <w:sz w:val="21"/>
-        </w:rPr>
-        <w:t>P&amp;L timing:</w:t>
-      </w:r>
-      <w:r>
-        <w:rPr>
-          <w:rFonts w:ascii="Aptos" w:hAnsi="Aptos" w:cs="Aptos"/>
-          <w:b w:val="0"/>
-          <w:i w:val="0"/>
-          <w:color w:val="222222"/>
-          <w:sz w:val="21"/>
-        </w:rPr>
-        <w:t xml:space="preserve"> on the project's P&amp;L recognition tab, set the start month (first deposit invoice) and the total timeline in months; the stages split automatically (e.g. 14 months = 3/3/4/2/2). Lock the baseline once agreed.</w:t>
-      </w:r>
-    </w:p>
-    <w:p>
-      <w:pPr>
-        <w:spacing w:before="0" w:after="60" w:line="250" w:lineRule="auto"/>
-        <w:pStyle w:val="ListParagraph"/>
-        <w:numPr>
-          <w:ilvl w:val="0"/>
-          <w:numId w:val="3"/>
-        </w:numPr>
-      </w:pPr>
-      <w:r>
-        <w:rPr>
-          <w:rFonts w:ascii="Aptos" w:hAnsi="Aptos" w:cs="Aptos"/>
-          <w:b/>
-          <w:i w:val="0"/>
-          <w:color w:val="222222"/>
-          <w:sz w:val="21"/>
-        </w:rPr>
-        <w:t>Check:</w:t>
-      </w:r>
-      <w:r>
-        <w:rPr>
-          <w:rFonts w:ascii="Aptos" w:hAnsi="Aptos" w:cs="Aptos"/>
-          <w:b w:val="0"/>
-          <w:i w:val="0"/>
-          <w:color w:val="222222"/>
-          <w:sz w:val="21"/>
-        </w:rPr>
-        <w:t xml:space="preserve"> the project appears on the dashboard and its cashflow sheet is created at the next sync. Check the first Needs attention list and link anything unassigned.</w:t>
-      </w:r>
-    </w:p>
-    <w:p>
-      <w:pPr>
-        <w:spacing w:before="0" w:after="100" w:line="250" w:lineRule="auto"/>
-      </w:pPr>
-      <w:r>
-        <w:rPr>
-          <w:rFonts w:ascii="Aptos" w:hAnsi="Aptos" w:cs="Aptos"/>
-          <w:b w:val="0"/>
-          <w:i/>
-          <w:color w:val="222222"/>
-          <w:sz w:val="21"/>
-        </w:rPr>
-        <w:t>Safeguard: the dashboard's All live projects page lists any NetSuite job with POs, bills or invoices in the last six months that is not in the Projects sheet. Set it up, or, if it is not a project to track (R&amp;D, service), add it with Status Closed and it stops showing.</w:t>
+        <w:t>There is one way a project gets onto the app. It starts when the customer PO arrives, and three things happen in order. Nobody types forecast lines: they come from the costing.</w:t>
       </w:r>
     </w:p>
     <w:tbl>
@@ -1340,14 +1115,15 @@
         </w:tblBorders>
       </w:tblPr>
       <w:tblGrid>
-        <w:gridCol w:w="3185"/>
-        <w:gridCol w:w="3185"/>
-        <w:gridCol w:w="3185"/>
+        <w:gridCol w:w="2389"/>
+        <w:gridCol w:w="2389"/>
+        <w:gridCol w:w="2389"/>
+        <w:gridCol w:w="2389"/>
       </w:tblGrid>
       <w:tr>
         <w:tc>
           <w:tcPr>
-            <w:tcW w:type="dxa" w:w="3175"/>
+            <w:tcW w:type="dxa" w:w="680"/>
             <w:shd w:val="clear" w:color="auto" w:fill="16324F"/>
             <w:tcMar>
               <w:top w:w="26" w:type="dxa"/>
@@ -1369,13 +1145,13 @@
                 <w:color w:val="FFFFFF"/>
                 <w:sz w:val="18"/>
               </w:rPr>
-              <w:t>Costing (live tab)</w:t>
-            </w:r>
-          </w:p>
-        </w:tc>
-        <w:tc>
-          <w:tcPr>
-            <w:tcW w:type="dxa" w:w="2608"/>
+              <w:t>Step</w:t>
+            </w:r>
+          </w:p>
+        </w:tc>
+        <w:tc>
+          <w:tcPr>
+            <w:tcW w:type="dxa" w:w="1361"/>
             <w:shd w:val="clear" w:color="auto" w:fill="16324F"/>
             <w:tcMar>
               <w:top w:w="26" w:type="dxa"/>
@@ -1397,13 +1173,13 @@
                 <w:color w:val="FFFFFF"/>
                 <w:sz w:val="18"/>
               </w:rPr>
-              <w:t>Becomes</w:t>
-            </w:r>
-          </w:p>
-        </w:tc>
-        <w:tc>
-          <w:tcPr>
-            <w:tcW w:type="dxa" w:w="4309"/>
+              <w:t>Who</w:t>
+            </w:r>
+          </w:p>
+        </w:tc>
+        <w:tc>
+          <w:tcPr>
+            <w:tcW w:type="dxa" w:w="5896"/>
             <w:shd w:val="clear" w:color="auto" w:fill="16324F"/>
             <w:tcMar>
               <w:top w:w="26" w:type="dxa"/>
@@ -1425,7 +1201,35 @@
                 <w:color w:val="FFFFFF"/>
                 <w:sz w:val="18"/>
               </w:rPr>
-              <w:t>Notes</w:t>
+              <w:t>What</w:t>
+            </w:r>
+          </w:p>
+        </w:tc>
+        <w:tc>
+          <w:tcPr>
+            <w:tcW w:type="dxa" w:w="2154"/>
+            <w:shd w:val="clear" w:color="auto" w:fill="16324F"/>
+            <w:tcMar>
+              <w:top w:w="26" w:type="dxa"/>
+              <w:bottom w:w="26" w:type="dxa"/>
+              <w:start w:w="70" w:type="dxa"/>
+              <w:end w:w="70" w:type="dxa"/>
+            </w:tcMar>
+            <w:vAlign w:val="center"/>
+          </w:tcPr>
+          <w:p>
+            <w:pPr>
+              <w:spacing w:after="0" w:line="240" w:lineRule="auto"/>
+            </w:pPr>
+            <w:r>
+              <w:rPr>
+                <w:rFonts w:ascii="Aptos" w:hAnsi="Aptos" w:cs="Aptos"/>
+                <w:b/>
+                <w:i w:val="0"/>
+                <w:color w:val="FFFFFF"/>
+                <w:sz w:val="18"/>
+              </w:rPr>
+              <w:t>Prompted by</w:t>
             </w:r>
           </w:p>
         </w:tc>
@@ -1433,7 +1237,7 @@
       <w:tr>
         <w:tc>
           <w:tcPr>
-            <w:tcW w:type="dxa" w:w="3175"/>
+            <w:tcW w:type="dxa" w:w="680"/>
             <w:tcMar>
               <w:top w:w="26" w:type="dxa"/>
               <w:bottom w:w="26" w:type="dxa"/>
@@ -1454,13 +1258,13 @@
                 <w:color w:val="222222"/>
                 <w:sz w:val="17"/>
               </w:rPr>
-              <w:t>Each supplier package or section (e.g. Welkin - System, DAF System, Site install)</w:t>
-            </w:r>
-          </w:p>
-        </w:tc>
-        <w:tc>
-          <w:tcPr>
-            <w:tcW w:type="dxa" w:w="2608"/>
+              <w:t>1</w:t>
+            </w:r>
+          </w:p>
+        </w:tc>
+        <w:tc>
+          <w:tcPr>
+            <w:tcW w:type="dxa" w:w="1361"/>
             <w:tcMar>
               <w:top w:w="26" w:type="dxa"/>
               <w:bottom w:w="26" w:type="dxa"/>
@@ -1481,13 +1285,13 @@
                 <w:color w:val="222222"/>
                 <w:sz w:val="17"/>
               </w:rPr>
-              <w:t>One outgoing forecast line</w:t>
-            </w:r>
-          </w:p>
-        </w:tc>
-        <w:tc>
-          <w:tcPr>
-            <w:tcW w:type="dxa" w:w="4309"/>
+              <w:t>Accounts</w:t>
+            </w:r>
+          </w:p>
+        </w:tc>
+        <w:tc>
+          <w:tcPr>
+            <w:tcW w:type="dxa" w:w="5896"/>
             <w:tcMar>
               <w:top w:w="26" w:type="dxa"/>
               <w:bottom w:w="26" w:type="dxa"/>
@@ -1508,7 +1312,34 @@
                 <w:color w:val="222222"/>
                 <w:sz w:val="17"/>
               </w:rPr>
-              <w:t>Party = the supplier; Cost Type from the dropdown; Amount = extended cost; expected date = when the PO is planned. Small BHF-supplied items can share one line.</w:t>
+              <w:t>Create the job (customer:job) in NetSuite and raise the sales order for the customer PO, coded to the job. For a new customer, also create its Unearned Income (21xx) and Project WIP (115x) accounts.</w:t>
+            </w:r>
+          </w:p>
+        </w:tc>
+        <w:tc>
+          <w:tcPr>
+            <w:tcW w:type="dxa" w:w="2154"/>
+            <w:tcMar>
+              <w:top w:w="26" w:type="dxa"/>
+              <w:bottom w:w="26" w:type="dxa"/>
+              <w:start w:w="70" w:type="dxa"/>
+              <w:end w:w="70" w:type="dxa"/>
+            </w:tcMar>
+            <w:vAlign w:val="top"/>
+          </w:tcPr>
+          <w:p>
+            <w:pPr>
+              <w:spacing w:after="0" w:line="240" w:lineRule="auto"/>
+            </w:pPr>
+            <w:r>
+              <w:rPr>
+                <w:rFonts w:ascii="Aptos" w:hAnsi="Aptos" w:cs="Aptos"/>
+                <w:b w:val="0"/>
+                <w:i w:val="0"/>
+                <w:color w:val="222222"/>
+                <w:sz w:val="17"/>
+              </w:rPr>
+              <w:t>Customer PO received</w:t>
             </w:r>
           </w:p>
         </w:tc>
@@ -1516,7 +1347,7 @@
       <w:tr>
         <w:tc>
           <w:tcPr>
-            <w:tcW w:type="dxa" w:w="3175"/>
+            <w:tcW w:type="dxa" w:w="680"/>
             <w:tcMar>
               <w:top w:w="26" w:type="dxa"/>
               <w:bottom w:w="26" w:type="dxa"/>
@@ -1538,13 +1369,13 @@
                 <w:color w:val="222222"/>
                 <w:sz w:val="17"/>
               </w:rPr>
-              <w:t>Lines at $800/day (Project Management, Engineering, Procurement, Commissioning)</w:t>
-            </w:r>
-          </w:p>
-        </w:tc>
-        <w:tc>
-          <w:tcPr>
-            <w:tcW w:type="dxa" w:w="2608"/>
+              <w:t>2</w:t>
+            </w:r>
+          </w:p>
+        </w:tc>
+        <w:tc>
+          <w:tcPr>
+            <w:tcW w:type="dxa" w:w="1361"/>
             <w:tcMar>
               <w:top w:w="26" w:type="dxa"/>
               <w:bottom w:w="26" w:type="dxa"/>
@@ -1566,13 +1397,13 @@
                 <w:color w:val="222222"/>
                 <w:sz w:val="17"/>
               </w:rPr>
-              <w:t>Internal Labour on the Projects sheet</w:t>
-            </w:r>
-          </w:p>
-        </w:tc>
-        <w:tc>
-          <w:tcPr>
-            <w:tcW w:type="dxa" w:w="4309"/>
+              <w:t>PM</w:t>
+            </w:r>
+          </w:p>
+        </w:tc>
+        <w:tc>
+          <w:tcPr>
+            <w:tcW w:type="dxa" w:w="5896"/>
             <w:tcMar>
               <w:top w:w="26" w:type="dxa"/>
               <w:bottom w:w="26" w:type="dxa"/>
@@ -1594,7 +1425,35 @@
                 <w:color w:val="222222"/>
                 <w:sz w:val="17"/>
               </w:rPr>
-              <w:t>Not a forecast line: BHF time, used for net margin.</w:t>
+              <w:t>Create the job's SharePoint folder from the template in 2.0 Projects Contracted (named "{code} {name}") and save the final costing in 1.0 Working Folder / 0.3 Costing &amp; Cashflow.</w:t>
+            </w:r>
+          </w:p>
+        </w:tc>
+        <w:tc>
+          <w:tcPr>
+            <w:tcW w:type="dxa" w:w="2154"/>
+            <w:tcMar>
+              <w:top w:w="26" w:type="dxa"/>
+              <w:bottom w:w="26" w:type="dxa"/>
+              <w:start w:w="70" w:type="dxa"/>
+              <w:end w:w="70" w:type="dxa"/>
+            </w:tcMar>
+            <w:vAlign w:val="top"/>
+            <w:shd w:val="clear" w:color="auto" w:fill="EEF3FA"/>
+          </w:tcPr>
+          <w:p>
+            <w:pPr>
+              <w:spacing w:after="0" w:line="240" w:lineRule="auto"/>
+            </w:pPr>
+            <w:r>
+              <w:rPr>
+                <w:rFonts w:ascii="Aptos" w:hAnsi="Aptos" w:cs="Aptos"/>
+                <w:b w:val="0"/>
+                <w:i w:val="0"/>
+                <w:color w:val="222222"/>
+                <w:sz w:val="17"/>
+              </w:rPr>
+              <w:t>Same day as step 1</w:t>
             </w:r>
           </w:p>
         </w:tc>
@@ -1602,7 +1461,7 @@
       <w:tr>
         <w:tc>
           <w:tcPr>
-            <w:tcW w:type="dxa" w:w="3175"/>
+            <w:tcW w:type="dxa" w:w="680"/>
             <w:tcMar>
               <w:top w:w="26" w:type="dxa"/>
               <w:bottom w:w="26" w:type="dxa"/>
@@ -1623,13 +1482,13 @@
                 <w:color w:val="222222"/>
                 <w:sz w:val="17"/>
               </w:rPr>
-              <w:t>Contingency lines</w:t>
-            </w:r>
-          </w:p>
-        </w:tc>
-        <w:tc>
-          <w:tcPr>
-            <w:tcW w:type="dxa" w:w="2608"/>
+              <w:t>3</w:t>
+            </w:r>
+          </w:p>
+        </w:tc>
+        <w:tc>
+          <w:tcPr>
+            <w:tcW w:type="dxa" w:w="1361"/>
             <w:tcMar>
               <w:top w:w="26" w:type="dxa"/>
               <w:bottom w:w="26" w:type="dxa"/>
@@ -1650,13 +1509,13 @@
                 <w:color w:val="222222"/>
                 <w:sz w:val="17"/>
               </w:rPr>
-              <w:t>One outgoing line "Contingency"</w:t>
-            </w:r>
-          </w:p>
-        </w:tc>
-        <w:tc>
-          <w:tcPr>
-            <w:tcW w:type="dxa" w:w="4309"/>
+              <w:t>Automatic</w:t>
+            </w:r>
+          </w:p>
+        </w:tc>
+        <w:tc>
+          <w:tcPr>
+            <w:tcW w:type="dxa" w:w="5896"/>
             <w:tcMar>
               <w:top w:w="26" w:type="dxa"/>
               <w:bottom w:w="26" w:type="dxa"/>
@@ -1677,7 +1536,34 @@
                 <w:color w:val="222222"/>
                 <w:sz w:val="17"/>
               </w:rPr>
-              <w:t>Tick Closed when no longer needed.</w:t>
+              <w:t>At the next 07:30 run the app finds the new NetSuite job and its folder, reads the costing and sets the project up (below). The sync then pulls its NetSuite documents and creates its cashflow sheet.</w:t>
+            </w:r>
+          </w:p>
+        </w:tc>
+        <w:tc>
+          <w:tcPr>
+            <w:tcW w:type="dxa" w:w="2154"/>
+            <w:tcMar>
+              <w:top w:w="26" w:type="dxa"/>
+              <w:bottom w:w="26" w:type="dxa"/>
+              <w:start w:w="70" w:type="dxa"/>
+              <w:end w:w="70" w:type="dxa"/>
+            </w:tcMar>
+            <w:vAlign w:val="top"/>
+          </w:tcPr>
+          <w:p>
+            <w:pPr>
+              <w:spacing w:after="0" w:line="240" w:lineRule="auto"/>
+            </w:pPr>
+            <w:r>
+              <w:rPr>
+                <w:rFonts w:ascii="Aptos" w:hAnsi="Aptos" w:cs="Aptos"/>
+                <w:b w:val="0"/>
+                <w:i w:val="0"/>
+                <w:color w:val="222222"/>
+                <w:sz w:val="17"/>
+              </w:rPr>
+              <w:t>Steps 1 and 2 done</w:t>
             </w:r>
           </w:p>
         </w:tc>
@@ -1685,7 +1571,7 @@
       <w:tr>
         <w:tc>
           <w:tcPr>
-            <w:tcW w:type="dxa" w:w="3175"/>
+            <w:tcW w:type="dxa" w:w="680"/>
             <w:tcMar>
               <w:top w:w="26" w:type="dxa"/>
               <w:bottom w:w="26" w:type="dxa"/>
@@ -1707,13 +1593,13 @@
                 <w:color w:val="222222"/>
                 <w:sz w:val="17"/>
               </w:rPr>
-              <w:t>Bid / contract price</w:t>
-            </w:r>
-          </w:p>
-        </w:tc>
-        <w:tc>
-          <w:tcPr>
-            <w:tcW w:type="dxa" w:w="2608"/>
+              <w:t>4</w:t>
+            </w:r>
+          </w:p>
+        </w:tc>
+        <w:tc>
+          <w:tcPr>
+            <w:tcW w:type="dxa" w:w="1361"/>
             <w:tcMar>
               <w:top w:w="26" w:type="dxa"/>
               <w:bottom w:w="26" w:type="dxa"/>
@@ -1735,13 +1621,13 @@
                 <w:color w:val="222222"/>
                 <w:sz w:val="17"/>
               </w:rPr>
-              <w:t>Contract Value; incoming line(s)</w:t>
-            </w:r>
-          </w:p>
-        </w:tc>
-        <w:tc>
-          <w:tcPr>
-            <w:tcW w:type="dxa" w:w="4309"/>
+              <w:t>PM</w:t>
+            </w:r>
+          </w:p>
+        </w:tc>
+        <w:tc>
+          <w:tcPr>
+            <w:tcW w:type="dxa" w:w="5896"/>
             <w:tcMar>
               <w:top w:w="26" w:type="dxa"/>
               <w:bottom w:w="26" w:type="dxa"/>
@@ -1763,7 +1649,143 @@
                 <w:color w:val="222222"/>
                 <w:sz w:val="17"/>
               </w:rPr>
-              <w:t>One incoming line per customer PO, with the customer PO number.</w:t>
+              <w:t>Open the project on the dashboard: check the lines, add the customer PO number and payment milestones on Main contract, set the P&amp;L start month and total timeline, then acknowledge "New project".</w:t>
+            </w:r>
+          </w:p>
+        </w:tc>
+        <w:tc>
+          <w:tcPr>
+            <w:tcW w:type="dxa" w:w="2154"/>
+            <w:tcMar>
+              <w:top w:w="26" w:type="dxa"/>
+              <w:bottom w:w="26" w:type="dxa"/>
+              <w:start w:w="70" w:type="dxa"/>
+              <w:end w:w="70" w:type="dxa"/>
+            </w:tcMar>
+            <w:vAlign w:val="top"/>
+            <w:shd w:val="clear" w:color="auto" w:fill="EEF3FA"/>
+          </w:tcPr>
+          <w:p>
+            <w:pPr>
+              <w:spacing w:after="0" w:line="240" w:lineRule="auto"/>
+            </w:pPr>
+            <w:r>
+              <w:rPr>
+                <w:rFonts w:ascii="Aptos" w:hAnsi="Aptos" w:cs="Aptos"/>
+                <w:b w:val="0"/>
+                <w:i w:val="0"/>
+                <w:color w:val="222222"/>
+                <w:sz w:val="17"/>
+              </w:rPr>
+              <w:t>"New project" under Needs attention</w:t>
+            </w:r>
+          </w:p>
+        </w:tc>
+      </w:tr>
+    </w:tbl>
+    <w:p>
+      <w:pPr>
+        <w:spacing w:before="0" w:after="80" w:line="250" w:lineRule="auto"/>
+      </w:pPr>
+      <w:r>
+        <w:rPr>
+          <w:rFonts w:ascii="Aptos" w:hAnsi="Aptos" w:cs="Aptos"/>
+          <w:b w:val="0"/>
+          <w:i/>
+          <w:color w:val="5F6B76"/>
+          <w:sz w:val="17"/>
+        </w:rPr>
+        <w:t>Want it now rather than at 07:30? Run  python -m bhf.setup_projects  on the filing PC.</w:t>
+      </w:r>
+    </w:p>
+    <w:p>
+      <w:pPr>
+        <w:spacing w:before="0" w:after="100" w:line="250" w:lineRule="auto"/>
+      </w:pPr>
+      <w:r>
+        <w:rPr>
+          <w:rFonts w:ascii="Aptos" w:hAnsi="Aptos" w:cs="Aptos"/>
+          <w:b w:val="0"/>
+          <w:i w:val="0"/>
+          <w:color w:val="222222"/>
+          <w:sz w:val="21"/>
+        </w:rPr>
+        <w:t>What the automatic set-up creates, replicating the costing exactly (the live costing tab, i.e. the one whose price matches the contract):</w:t>
+      </w:r>
+    </w:p>
+    <w:tbl>
+      <w:tblPr>
+        <w:tblW w:type="auto" w:w="0"/>
+        <w:jc w:val="center"/>
+        <w:tblLayout w:type="fixed"/>
+        <w:tblLook w:firstColumn="1" w:firstRow="1" w:lastColumn="0" w:lastRow="0" w:noHBand="0" w:noVBand="1" w:val="04A0"/>
+        <w:tblBorders>
+          <w:top w:val="single" w:sz="4" w:space="0" w:color="B7C6D9"/>
+          <w:left w:val="single" w:sz="4" w:space="0" w:color="B7C6D9"/>
+          <w:bottom w:val="single" w:sz="4" w:space="0" w:color="B7C6D9"/>
+          <w:right w:val="single" w:sz="4" w:space="0" w:color="B7C6D9"/>
+          <w:insideH w:val="single" w:sz="4" w:space="0" w:color="B7C6D9"/>
+          <w:insideV w:val="single" w:sz="4" w:space="0" w:color="B7C6D9"/>
+        </w:tblBorders>
+      </w:tblPr>
+      <w:tblGrid>
+        <w:gridCol w:w="4778"/>
+        <w:gridCol w:w="4778"/>
+      </w:tblGrid>
+      <w:tr>
+        <w:tc>
+          <w:tcPr>
+            <w:tcW w:type="dxa" w:w="3969"/>
+            <w:shd w:val="clear" w:color="auto" w:fill="16324F"/>
+            <w:tcMar>
+              <w:top w:w="26" w:type="dxa"/>
+              <w:bottom w:w="26" w:type="dxa"/>
+              <w:start w:w="70" w:type="dxa"/>
+              <w:end w:w="70" w:type="dxa"/>
+            </w:tcMar>
+            <w:vAlign w:val="center"/>
+          </w:tcPr>
+          <w:p>
+            <w:pPr>
+              <w:spacing w:after="0" w:line="240" w:lineRule="auto"/>
+            </w:pPr>
+            <w:r>
+              <w:rPr>
+                <w:rFonts w:ascii="Aptos" w:hAnsi="Aptos" w:cs="Aptos"/>
+                <w:b/>
+                <w:i w:val="0"/>
+                <w:color w:val="FFFFFF"/>
+                <w:sz w:val="18"/>
+              </w:rPr>
+              <w:t>From</w:t>
+            </w:r>
+          </w:p>
+        </w:tc>
+        <w:tc>
+          <w:tcPr>
+            <w:tcW w:type="dxa" w:w="6123"/>
+            <w:shd w:val="clear" w:color="auto" w:fill="16324F"/>
+            <w:tcMar>
+              <w:top w:w="26" w:type="dxa"/>
+              <w:bottom w:w="26" w:type="dxa"/>
+              <w:start w:w="70" w:type="dxa"/>
+              <w:end w:w="70" w:type="dxa"/>
+            </w:tcMar>
+            <w:vAlign w:val="center"/>
+          </w:tcPr>
+          <w:p>
+            <w:pPr>
+              <w:spacing w:after="0" w:line="240" w:lineRule="auto"/>
+            </w:pPr>
+            <w:r>
+              <w:rPr>
+                <w:rFonts w:ascii="Aptos" w:hAnsi="Aptos" w:cs="Aptos"/>
+                <w:b/>
+                <w:i w:val="0"/>
+                <w:color w:val="FFFFFF"/>
+                <w:sz w:val="18"/>
+              </w:rPr>
+              <w:t>Becomes</w:t>
             </w:r>
           </w:p>
         </w:tc>
@@ -1771,7 +1793,7 @@
       <w:tr>
         <w:tc>
           <w:tcPr>
-            <w:tcW w:type="dxa" w:w="3175"/>
+            <w:tcW w:type="dxa" w:w="3969"/>
             <w:tcMar>
               <w:top w:w="26" w:type="dxa"/>
               <w:bottom w:w="26" w:type="dxa"/>
@@ -1792,13 +1814,13 @@
                 <w:color w:val="222222"/>
                 <w:sz w:val="17"/>
               </w:rPr>
-              <w:t>Options not taken (quantity 0)</w:t>
-            </w:r>
-          </w:p>
-        </w:tc>
-        <w:tc>
-          <w:tcPr>
-            <w:tcW w:type="dxa" w:w="2608"/>
+              <w:t>Each costing line with a cost (options not taken are skipped)</w:t>
+            </w:r>
+          </w:p>
+        </w:tc>
+        <w:tc>
+          <w:tcPr>
+            <w:tcW w:type="dxa" w:w="6123"/>
             <w:tcMar>
               <w:top w:w="26" w:type="dxa"/>
               <w:bottom w:w="26" w:type="dxa"/>
@@ -1819,20 +1841,51 @@
                 <w:color w:val="222222"/>
                 <w:sz w:val="17"/>
               </w:rPr>
-              <w:t>Nothing</w:t>
-            </w:r>
-          </w:p>
-        </w:tc>
-        <w:tc>
-          <w:tcPr>
-            <w:tcW w:type="dxa" w:w="4309"/>
-            <w:tcMar>
-              <w:top w:w="26" w:type="dxa"/>
-              <w:bottom w:w="26" w:type="dxa"/>
-              <w:start w:w="70" w:type="dxa"/>
-              <w:end w:w="70" w:type="dxa"/>
-            </w:tcMar>
-            <w:vAlign w:val="top"/>
+              <w:t>One outgoing forecast line: item, supplier and extended cost as costed; section and description in Notes; Cost Type from the item (equipment, freight, install, contingency...).</w:t>
+            </w:r>
+          </w:p>
+        </w:tc>
+      </w:tr>
+      <w:tr>
+        <w:tc>
+          <w:tcPr>
+            <w:tcW w:type="dxa" w:w="3969"/>
+            <w:tcMar>
+              <w:top w:w="26" w:type="dxa"/>
+              <w:bottom w:w="26" w:type="dxa"/>
+              <w:start w:w="70" w:type="dxa"/>
+              <w:end w:w="70" w:type="dxa"/>
+            </w:tcMar>
+            <w:vAlign w:val="top"/>
+            <w:shd w:val="clear" w:color="auto" w:fill="EEF3FA"/>
+          </w:tcPr>
+          <w:p>
+            <w:pPr>
+              <w:spacing w:after="0" w:line="240" w:lineRule="auto"/>
+            </w:pPr>
+            <w:r>
+              <w:rPr>
+                <w:rFonts w:ascii="Aptos" w:hAnsi="Aptos" w:cs="Aptos"/>
+                <w:b/>
+                <w:i w:val="0"/>
+                <w:color w:val="222222"/>
+                <w:sz w:val="17"/>
+              </w:rPr>
+              <w:t>Lines charged at $800/day (PM, engineering, procurement, commissioning)</w:t>
+            </w:r>
+          </w:p>
+        </w:tc>
+        <w:tc>
+          <w:tcPr>
+            <w:tcW w:type="dxa" w:w="6123"/>
+            <w:tcMar>
+              <w:top w:w="26" w:type="dxa"/>
+              <w:bottom w:w="26" w:type="dxa"/>
+              <w:start w:w="70" w:type="dxa"/>
+              <w:end w:w="70" w:type="dxa"/>
+            </w:tcMar>
+            <w:vAlign w:val="top"/>
+            <w:shd w:val="clear" w:color="auto" w:fill="EEF3FA"/>
           </w:tcPr>
           <w:p>
             <w:pPr>
@@ -1846,11 +1899,141 @@
                 <w:color w:val="222222"/>
                 <w:sz w:val="17"/>
               </w:rPr>
+              <w:t>Internal Labour on the Projects row (BHF time, not cash out).</w:t>
+            </w:r>
+          </w:p>
+        </w:tc>
+      </w:tr>
+      <w:tr>
+        <w:tc>
+          <w:tcPr>
+            <w:tcW w:type="dxa" w:w="3969"/>
+            <w:tcMar>
+              <w:top w:w="26" w:type="dxa"/>
+              <w:bottom w:w="26" w:type="dxa"/>
+              <w:start w:w="70" w:type="dxa"/>
+              <w:end w:w="70" w:type="dxa"/>
+            </w:tcMar>
+            <w:vAlign w:val="top"/>
+          </w:tcPr>
+          <w:p>
+            <w:pPr>
+              <w:spacing w:after="0" w:line="240" w:lineRule="auto"/>
+            </w:pPr>
+            <w:r>
+              <w:rPr>
+                <w:rFonts w:ascii="Aptos" w:hAnsi="Aptos" w:cs="Aptos"/>
+                <w:b/>
+                <w:i w:val="0"/>
+                <w:color w:val="222222"/>
+                <w:sz w:val="17"/>
+              </w:rPr>
+              <w:t>Sales order total in NetSuite (else the costing's bid price)</w:t>
+            </w:r>
+          </w:p>
+        </w:tc>
+        <w:tc>
+          <w:tcPr>
+            <w:tcW w:type="dxa" w:w="6123"/>
+            <w:tcMar>
+              <w:top w:w="26" w:type="dxa"/>
+              <w:bottom w:w="26" w:type="dxa"/>
+              <w:start w:w="70" w:type="dxa"/>
+              <w:end w:w="70" w:type="dxa"/>
+            </w:tcMar>
+            <w:vAlign w:val="top"/>
+          </w:tcPr>
+          <w:p>
+            <w:pPr>
+              <w:spacing w:after="0" w:line="240" w:lineRule="auto"/>
+            </w:pPr>
+            <w:r>
+              <w:rPr>
+                <w:rFonts w:ascii="Aptos" w:hAnsi="Aptos" w:cs="Aptos"/>
+                <w:b w:val="0"/>
+                <w:i w:val="0"/>
+                <w:color w:val="222222"/>
+                <w:sz w:val="17"/>
+              </w:rPr>
+              <w:t>Contract Value, and the incoming "Main contract" line.</w:t>
+            </w:r>
+          </w:p>
+        </w:tc>
+      </w:tr>
+      <w:tr>
+        <w:tc>
+          <w:tcPr>
+            <w:tcW w:type="dxa" w:w="3969"/>
+            <w:tcMar>
+              <w:top w:w="26" w:type="dxa"/>
+              <w:bottom w:w="26" w:type="dxa"/>
+              <w:start w:w="70" w:type="dxa"/>
+              <w:end w:w="70" w:type="dxa"/>
+            </w:tcMar>
+            <w:vAlign w:val="top"/>
+            <w:shd w:val="clear" w:color="auto" w:fill="EEF3FA"/>
+          </w:tcPr>
+          <w:p>
+            <w:pPr>
+              <w:spacing w:after="0" w:line="240" w:lineRule="auto"/>
+            </w:pPr>
+            <w:r>
+              <w:rPr>
+                <w:rFonts w:ascii="Aptos" w:hAnsi="Aptos" w:cs="Aptos"/>
+                <w:b/>
+                <w:i w:val="0"/>
+                <w:color w:val="222222"/>
+                <w:sz w:val="17"/>
+              </w:rPr>
+              <w:t>NetSuite job, SharePoint folder</w:t>
+            </w:r>
+          </w:p>
+        </w:tc>
+        <w:tc>
+          <w:tcPr>
+            <w:tcW w:type="dxa" w:w="6123"/>
+            <w:tcMar>
+              <w:top w:w="26" w:type="dxa"/>
+              <w:bottom w:w="26" w:type="dxa"/>
+              <w:start w:w="70" w:type="dxa"/>
+              <w:end w:w="70" w:type="dxa"/>
+            </w:tcMar>
+            <w:vAlign w:val="top"/>
+            <w:shd w:val="clear" w:color="auto" w:fill="EEF3FA"/>
+          </w:tcPr>
+          <w:p>
+            <w:pPr>
+              <w:spacing w:after="0" w:line="240" w:lineRule="auto"/>
+            </w:pPr>
+            <w:r>
+              <w:rPr>
+                <w:rFonts w:ascii="Aptos" w:hAnsi="Aptos" w:cs="Aptos"/>
+                <w:b w:val="0"/>
+                <w:i w:val="0"/>
+                <w:color w:val="222222"/>
+                <w:sz w:val="17"/>
+              </w:rPr>
+              <w:t>The Projects row (code, name, job ID, Live, folder) and the Smartsheet project folder copied from the template.</w:t>
             </w:r>
           </w:p>
         </w:tc>
       </w:tr>
     </w:tbl>
+    <w:p>
+      <w:pPr>
+        <w:spacing w:before="0" w:after="100" w:line="250" w:lineRule="auto"/>
+      </w:pPr>
+      <w:r>
+        <w:rPr>
+          <w:rFonts w:ascii="Aptos" w:hAnsi="Aptos" w:cs="Aptos"/>
+          <w:b w:val="0"/>
+          <w:i/>
+          <w:color w:val="222222"/>
+          <w:sz w:val="21"/>
+        </w:rPr>
+        <w:t>Safeguard: All live projects lists any NetSuite job with recent documents that is not set up yet. A new job waits there until its SharePoint folder exists. Older jobs with new activity (a service order on a finished job) and jobs not to track (R&amp;D) are never set up automatically: add them by hand, or with Status Closed to stop them showing.</w:t>
+      </w:r>
+    </w:p>
     <w:p>
       <w:pPr>
         <w:spacing w:before="200" w:after="60" w:line="250" w:lineRule="auto"/>

</xml_diff>

<commit_message>
Start-up rule: a Smartsheet project card + a matching SharePoint folder with a costing is all it takes; NetSuite job found by code; SOP section 4 rewritten
Co-Authored-By: Claude Opus 5.5 <noreply@anthropic.com>
</commit_message>
<xml_diff>
--- a/docs/BHF Project Cashflow SOP.docx
+++ b/docs/BHF Project Cashflow SOP.docx
@@ -1081,7 +1081,7 @@
           <w:color w:val="16324F"/>
           <w:sz w:val="26"/>
         </w:rPr>
-        <w:t>4.  Starting a project (one way in)</w:t>
+        <w:t>4.  Starting a project: the bare minimum</w:t>
       </w:r>
     </w:p>
     <w:p>
@@ -1096,7 +1096,7 @@
           <w:color w:val="222222"/>
           <w:sz w:val="21"/>
         </w:rPr>
-        <w:t>There is one way a project gets onto the app. It starts when the customer PO arrives, and three things happen in order. Nobody types forecast lines: they come from the costing.</w:t>
+        <w:t>A new project cashflow starts when these two things exist. Nothing else is needed.</w:t>
       </w:r>
     </w:p>
     <w:tbl>
@@ -1115,15 +1115,14 @@
         </w:tblBorders>
       </w:tblPr>
       <w:tblGrid>
-        <w:gridCol w:w="2389"/>
-        <w:gridCol w:w="2389"/>
-        <w:gridCol w:w="2389"/>
-        <w:gridCol w:w="2389"/>
+        <w:gridCol w:w="3185"/>
+        <w:gridCol w:w="3185"/>
+        <w:gridCol w:w="3185"/>
       </w:tblGrid>
       <w:tr>
         <w:tc>
           <w:tcPr>
-            <w:tcW w:type="dxa" w:w="680"/>
+            <w:tcW w:type="dxa" w:w="567"/>
             <w:shd w:val="clear" w:color="auto" w:fill="16324F"/>
             <w:tcMar>
               <w:top w:w="26" w:type="dxa"/>
@@ -1145,13 +1144,12 @@
                 <w:color w:val="FFFFFF"/>
                 <w:sz w:val="18"/>
               </w:rPr>
-              <w:t>Step</w:t>
-            </w:r>
-          </w:p>
-        </w:tc>
-        <w:tc>
-          <w:tcPr>
-            <w:tcW w:type="dxa" w:w="1361"/>
+            </w:r>
+          </w:p>
+        </w:tc>
+        <w:tc>
+          <w:tcPr>
+            <w:tcW w:type="dxa" w:w="7597"/>
             <w:shd w:val="clear" w:color="auto" w:fill="16324F"/>
             <w:tcMar>
               <w:top w:w="26" w:type="dxa"/>
@@ -1173,13 +1171,13 @@
                 <w:color w:val="FFFFFF"/>
                 <w:sz w:val="18"/>
               </w:rPr>
-              <w:t>Who</w:t>
-            </w:r>
-          </w:p>
-        </w:tc>
-        <w:tc>
-          <w:tcPr>
-            <w:tcW w:type="dxa" w:w="5896"/>
+              <w:t>What must exist</w:t>
+            </w:r>
+          </w:p>
+        </w:tc>
+        <w:tc>
+          <w:tcPr>
+            <w:tcW w:type="dxa" w:w="1928"/>
             <w:shd w:val="clear" w:color="auto" w:fill="16324F"/>
             <w:tcMar>
               <w:top w:w="26" w:type="dxa"/>
@@ -1201,35 +1199,7 @@
                 <w:color w:val="FFFFFF"/>
                 <w:sz w:val="18"/>
               </w:rPr>
-              <w:t>What</w:t>
-            </w:r>
-          </w:p>
-        </w:tc>
-        <w:tc>
-          <w:tcPr>
-            <w:tcW w:type="dxa" w:w="2154"/>
-            <w:shd w:val="clear" w:color="auto" w:fill="16324F"/>
-            <w:tcMar>
-              <w:top w:w="26" w:type="dxa"/>
-              <w:bottom w:w="26" w:type="dxa"/>
-              <w:start w:w="70" w:type="dxa"/>
-              <w:end w:w="70" w:type="dxa"/>
-            </w:tcMar>
-            <w:vAlign w:val="center"/>
-          </w:tcPr>
-          <w:p>
-            <w:pPr>
-              <w:spacing w:after="0" w:line="240" w:lineRule="auto"/>
-            </w:pPr>
-            <w:r>
-              <w:rPr>
-                <w:rFonts w:ascii="Aptos" w:hAnsi="Aptos" w:cs="Aptos"/>
-                <w:b/>
-                <w:i w:val="0"/>
-                <w:color w:val="FFFFFF"/>
-                <w:sz w:val="18"/>
-              </w:rPr>
-              <w:t>Prompted by</w:t>
+              <w:t>Who</w:t>
             </w:r>
           </w:p>
         </w:tc>
@@ -1237,7 +1207,7 @@
       <w:tr>
         <w:tc>
           <w:tcPr>
-            <w:tcW w:type="dxa" w:w="680"/>
+            <w:tcW w:type="dxa" w:w="567"/>
             <w:tcMar>
               <w:top w:w="26" w:type="dxa"/>
               <w:bottom w:w="26" w:type="dxa"/>
@@ -1264,7 +1234,7 @@
         </w:tc>
         <w:tc>
           <w:tcPr>
-            <w:tcW w:type="dxa" w:w="1361"/>
+            <w:tcW w:type="dxa" w:w="7597"/>
             <w:tcMar>
               <w:top w:w="26" w:type="dxa"/>
               <w:bottom w:w="26" w:type="dxa"/>
@@ -1285,13 +1255,13 @@
                 <w:color w:val="222222"/>
                 <w:sz w:val="17"/>
               </w:rPr>
-              <w:t>Accounts</w:t>
-            </w:r>
-          </w:p>
-        </w:tc>
-        <w:tc>
-          <w:tcPr>
-            <w:tcW w:type="dxa" w:w="5896"/>
+              <w:t>A project card in Smartsheet: the job's folder in 3. BHF Systems / 2. Contracted, copied from "BHF Project Contracted Template" and named "BHF26xxx Project name" (or a row in the Projects sheet).</w:t>
+            </w:r>
+          </w:p>
+        </w:tc>
+        <w:tc>
+          <w:tcPr>
+            <w:tcW w:type="dxa" w:w="1928"/>
             <w:tcMar>
               <w:top w:w="26" w:type="dxa"/>
               <w:bottom w:w="26" w:type="dxa"/>
@@ -1312,34 +1282,7 @@
                 <w:color w:val="222222"/>
                 <w:sz w:val="17"/>
               </w:rPr>
-              <w:t>Create the job (customer:job) in NetSuite and raise the sales order for the customer PO, coded to the job. For a new customer, also create its Unearned Income (21xx) and Project WIP (115x) accounts.</w:t>
-            </w:r>
-          </w:p>
-        </w:tc>
-        <w:tc>
-          <w:tcPr>
-            <w:tcW w:type="dxa" w:w="2154"/>
-            <w:tcMar>
-              <w:top w:w="26" w:type="dxa"/>
-              <w:bottom w:w="26" w:type="dxa"/>
-              <w:start w:w="70" w:type="dxa"/>
-              <w:end w:w="70" w:type="dxa"/>
-            </w:tcMar>
-            <w:vAlign w:val="top"/>
-          </w:tcPr>
-          <w:p>
-            <w:pPr>
-              <w:spacing w:after="0" w:line="240" w:lineRule="auto"/>
-            </w:pPr>
-            <w:r>
-              <w:rPr>
-                <w:rFonts w:ascii="Aptos" w:hAnsi="Aptos" w:cs="Aptos"/>
-                <w:b w:val="0"/>
-                <w:i w:val="0"/>
-                <w:color w:val="222222"/>
-                <w:sz w:val="17"/>
-              </w:rPr>
-              <w:t>Customer PO received</w:t>
+              <w:t>PM, at award</w:t>
             </w:r>
           </w:p>
         </w:tc>
@@ -1347,7 +1290,7 @@
       <w:tr>
         <w:tc>
           <w:tcPr>
-            <w:tcW w:type="dxa" w:w="680"/>
+            <w:tcW w:type="dxa" w:w="567"/>
             <w:tcMar>
               <w:top w:w="26" w:type="dxa"/>
               <w:bottom w:w="26" w:type="dxa"/>
@@ -1375,7 +1318,7 @@
         </w:tc>
         <w:tc>
           <w:tcPr>
-            <w:tcW w:type="dxa" w:w="1361"/>
+            <w:tcW w:type="dxa" w:w="7597"/>
             <w:tcMar>
               <w:top w:w="26" w:type="dxa"/>
               <w:bottom w:w="26" w:type="dxa"/>
@@ -1397,13 +1340,13 @@
                 <w:color w:val="222222"/>
                 <w:sz w:val="17"/>
               </w:rPr>
-              <w:t>PM</w:t>
-            </w:r>
-          </w:p>
-        </w:tc>
-        <w:tc>
-          <w:tcPr>
-            <w:tcW w:type="dxa" w:w="5896"/>
+              <w:t>The job's SharePoint folder in 2.0 Projects Contracted with the same code, and the costing saved in 1.0 Working Folder / 0.3 Costing &amp; Cashflow.</w:t>
+            </w:r>
+          </w:p>
+        </w:tc>
+        <w:tc>
+          <w:tcPr>
+            <w:tcW w:type="dxa" w:w="1928"/>
             <w:tcMar>
               <w:top w:w="26" w:type="dxa"/>
               <w:bottom w:w="26" w:type="dxa"/>
@@ -1425,279 +1368,12 @@
                 <w:color w:val="222222"/>
                 <w:sz w:val="17"/>
               </w:rPr>
-              <w:t>Create the job's SharePoint folder from the template in 2.0 Projects Contracted (named "{code} {name}") and save the final costing in 1.0 Working Folder / 0.3 Costing &amp; Cashflow.</w:t>
-            </w:r>
-          </w:p>
-        </w:tc>
-        <w:tc>
-          <w:tcPr>
-            <w:tcW w:type="dxa" w:w="2154"/>
-            <w:tcMar>
-              <w:top w:w="26" w:type="dxa"/>
-              <w:bottom w:w="26" w:type="dxa"/>
-              <w:start w:w="70" w:type="dxa"/>
-              <w:end w:w="70" w:type="dxa"/>
-            </w:tcMar>
-            <w:vAlign w:val="top"/>
-            <w:shd w:val="clear" w:color="auto" w:fill="EEF3FA"/>
-          </w:tcPr>
-          <w:p>
-            <w:pPr>
-              <w:spacing w:after="0" w:line="240" w:lineRule="auto"/>
-            </w:pPr>
-            <w:r>
-              <w:rPr>
-                <w:rFonts w:ascii="Aptos" w:hAnsi="Aptos" w:cs="Aptos"/>
-                <w:b w:val="0"/>
-                <w:i w:val="0"/>
-                <w:color w:val="222222"/>
-                <w:sz w:val="17"/>
-              </w:rPr>
-              <w:t>Same day as step 1</w:t>
-            </w:r>
-          </w:p>
-        </w:tc>
-      </w:tr>
-      <w:tr>
-        <w:tc>
-          <w:tcPr>
-            <w:tcW w:type="dxa" w:w="680"/>
-            <w:tcMar>
-              <w:top w:w="26" w:type="dxa"/>
-              <w:bottom w:w="26" w:type="dxa"/>
-              <w:start w:w="70" w:type="dxa"/>
-              <w:end w:w="70" w:type="dxa"/>
-            </w:tcMar>
-            <w:vAlign w:val="top"/>
-          </w:tcPr>
-          <w:p>
-            <w:pPr>
-              <w:spacing w:after="0" w:line="240" w:lineRule="auto"/>
-            </w:pPr>
-            <w:r>
-              <w:rPr>
-                <w:rFonts w:ascii="Aptos" w:hAnsi="Aptos" w:cs="Aptos"/>
-                <w:b/>
-                <w:i w:val="0"/>
-                <w:color w:val="222222"/>
-                <w:sz w:val="17"/>
-              </w:rPr>
-              <w:t>3</w:t>
-            </w:r>
-          </w:p>
-        </w:tc>
-        <w:tc>
-          <w:tcPr>
-            <w:tcW w:type="dxa" w:w="1361"/>
-            <w:tcMar>
-              <w:top w:w="26" w:type="dxa"/>
-              <w:bottom w:w="26" w:type="dxa"/>
-              <w:start w:w="70" w:type="dxa"/>
-              <w:end w:w="70" w:type="dxa"/>
-            </w:tcMar>
-            <w:vAlign w:val="top"/>
-          </w:tcPr>
-          <w:p>
-            <w:pPr>
-              <w:spacing w:after="0" w:line="240" w:lineRule="auto"/>
-            </w:pPr>
-            <w:r>
-              <w:rPr>
-                <w:rFonts w:ascii="Aptos" w:hAnsi="Aptos" w:cs="Aptos"/>
-                <w:b w:val="0"/>
-                <w:i w:val="0"/>
-                <w:color w:val="222222"/>
-                <w:sz w:val="17"/>
-              </w:rPr>
-              <w:t>Automatic</w:t>
-            </w:r>
-          </w:p>
-        </w:tc>
-        <w:tc>
-          <w:tcPr>
-            <w:tcW w:type="dxa" w:w="5896"/>
-            <w:tcMar>
-              <w:top w:w="26" w:type="dxa"/>
-              <w:bottom w:w="26" w:type="dxa"/>
-              <w:start w:w="70" w:type="dxa"/>
-              <w:end w:w="70" w:type="dxa"/>
-            </w:tcMar>
-            <w:vAlign w:val="top"/>
-          </w:tcPr>
-          <w:p>
-            <w:pPr>
-              <w:spacing w:after="0" w:line="240" w:lineRule="auto"/>
-            </w:pPr>
-            <w:r>
-              <w:rPr>
-                <w:rFonts w:ascii="Aptos" w:hAnsi="Aptos" w:cs="Aptos"/>
-                <w:b w:val="0"/>
-                <w:i w:val="0"/>
-                <w:color w:val="222222"/>
-                <w:sz w:val="17"/>
-              </w:rPr>
-              <w:t>At the next 07:30 run the app finds the new NetSuite job and its folder, reads the costing and sets the project up (below). The sync then pulls its NetSuite documents and creates its cashflow sheet.</w:t>
-            </w:r>
-          </w:p>
-        </w:tc>
-        <w:tc>
-          <w:tcPr>
-            <w:tcW w:type="dxa" w:w="2154"/>
-            <w:tcMar>
-              <w:top w:w="26" w:type="dxa"/>
-              <w:bottom w:w="26" w:type="dxa"/>
-              <w:start w:w="70" w:type="dxa"/>
-              <w:end w:w="70" w:type="dxa"/>
-            </w:tcMar>
-            <w:vAlign w:val="top"/>
-          </w:tcPr>
-          <w:p>
-            <w:pPr>
-              <w:spacing w:after="0" w:line="240" w:lineRule="auto"/>
-            </w:pPr>
-            <w:r>
-              <w:rPr>
-                <w:rFonts w:ascii="Aptos" w:hAnsi="Aptos" w:cs="Aptos"/>
-                <w:b w:val="0"/>
-                <w:i w:val="0"/>
-                <w:color w:val="222222"/>
-                <w:sz w:val="17"/>
-              </w:rPr>
-              <w:t>Steps 1 and 2 done</w:t>
-            </w:r>
-          </w:p>
-        </w:tc>
-      </w:tr>
-      <w:tr>
-        <w:tc>
-          <w:tcPr>
-            <w:tcW w:type="dxa" w:w="680"/>
-            <w:tcMar>
-              <w:top w:w="26" w:type="dxa"/>
-              <w:bottom w:w="26" w:type="dxa"/>
-              <w:start w:w="70" w:type="dxa"/>
-              <w:end w:w="70" w:type="dxa"/>
-            </w:tcMar>
-            <w:vAlign w:val="top"/>
-            <w:shd w:val="clear" w:color="auto" w:fill="EEF3FA"/>
-          </w:tcPr>
-          <w:p>
-            <w:pPr>
-              <w:spacing w:after="0" w:line="240" w:lineRule="auto"/>
-            </w:pPr>
-            <w:r>
-              <w:rPr>
-                <w:rFonts w:ascii="Aptos" w:hAnsi="Aptos" w:cs="Aptos"/>
-                <w:b/>
-                <w:i w:val="0"/>
-                <w:color w:val="222222"/>
-                <w:sz w:val="17"/>
-              </w:rPr>
-              <w:t>4</w:t>
-            </w:r>
-          </w:p>
-        </w:tc>
-        <w:tc>
-          <w:tcPr>
-            <w:tcW w:type="dxa" w:w="1361"/>
-            <w:tcMar>
-              <w:top w:w="26" w:type="dxa"/>
-              <w:bottom w:w="26" w:type="dxa"/>
-              <w:start w:w="70" w:type="dxa"/>
-              <w:end w:w="70" w:type="dxa"/>
-            </w:tcMar>
-            <w:vAlign w:val="top"/>
-            <w:shd w:val="clear" w:color="auto" w:fill="EEF3FA"/>
-          </w:tcPr>
-          <w:p>
-            <w:pPr>
-              <w:spacing w:after="0" w:line="240" w:lineRule="auto"/>
-            </w:pPr>
-            <w:r>
-              <w:rPr>
-                <w:rFonts w:ascii="Aptos" w:hAnsi="Aptos" w:cs="Aptos"/>
-                <w:b w:val="0"/>
-                <w:i w:val="0"/>
-                <w:color w:val="222222"/>
-                <w:sz w:val="17"/>
-              </w:rPr>
-              <w:t>PM</w:t>
-            </w:r>
-          </w:p>
-        </w:tc>
-        <w:tc>
-          <w:tcPr>
-            <w:tcW w:type="dxa" w:w="5896"/>
-            <w:tcMar>
-              <w:top w:w="26" w:type="dxa"/>
-              <w:bottom w:w="26" w:type="dxa"/>
-              <w:start w:w="70" w:type="dxa"/>
-              <w:end w:w="70" w:type="dxa"/>
-            </w:tcMar>
-            <w:vAlign w:val="top"/>
-            <w:shd w:val="clear" w:color="auto" w:fill="EEF3FA"/>
-          </w:tcPr>
-          <w:p>
-            <w:pPr>
-              <w:spacing w:after="0" w:line="240" w:lineRule="auto"/>
-            </w:pPr>
-            <w:r>
-              <w:rPr>
-                <w:rFonts w:ascii="Aptos" w:hAnsi="Aptos" w:cs="Aptos"/>
-                <w:b w:val="0"/>
-                <w:i w:val="0"/>
-                <w:color w:val="222222"/>
-                <w:sz w:val="17"/>
-              </w:rPr>
-              <w:t>Open the project on the dashboard: check the lines, add the customer PO number and payment milestones on Main contract, set the P&amp;L start month and total timeline, then acknowledge "New project".</w:t>
-            </w:r>
-          </w:p>
-        </w:tc>
-        <w:tc>
-          <w:tcPr>
-            <w:tcW w:type="dxa" w:w="2154"/>
-            <w:tcMar>
-              <w:top w:w="26" w:type="dxa"/>
-              <w:bottom w:w="26" w:type="dxa"/>
-              <w:start w:w="70" w:type="dxa"/>
-              <w:end w:w="70" w:type="dxa"/>
-            </w:tcMar>
-            <w:vAlign w:val="top"/>
-            <w:shd w:val="clear" w:color="auto" w:fill="EEF3FA"/>
-          </w:tcPr>
-          <w:p>
-            <w:pPr>
-              <w:spacing w:after="0" w:line="240" w:lineRule="auto"/>
-            </w:pPr>
-            <w:r>
-              <w:rPr>
-                <w:rFonts w:ascii="Aptos" w:hAnsi="Aptos" w:cs="Aptos"/>
-                <w:b w:val="0"/>
-                <w:i w:val="0"/>
-                <w:color w:val="222222"/>
-                <w:sz w:val="17"/>
-              </w:rPr>
-              <w:t>"New project" under Needs attention</w:t>
+              <w:t>PM, at award</w:t>
             </w:r>
           </w:p>
         </w:tc>
       </w:tr>
     </w:tbl>
-    <w:p>
-      <w:pPr>
-        <w:spacing w:before="0" w:after="80" w:line="250" w:lineRule="auto"/>
-      </w:pPr>
-      <w:r>
-        <w:rPr>
-          <w:rFonts w:ascii="Aptos" w:hAnsi="Aptos" w:cs="Aptos"/>
-          <w:b w:val="0"/>
-          <w:i/>
-          <w:color w:val="5F6B76"/>
-          <w:sz w:val="17"/>
-        </w:rPr>
-        <w:t>Want it now rather than at 07:30? Run  python -m bhf.setup_projects  on the filing PC.</w:t>
-      </w:r>
-    </w:p>
     <w:p>
       <w:pPr>
         <w:spacing w:before="0" w:after="100" w:line="250" w:lineRule="auto"/>
@@ -1710,7 +1386,7 @@
           <w:color w:val="222222"/>
           <w:sz w:val="21"/>
         </w:rPr>
-        <w:t>What the automatic set-up creates, replicating the costing exactly (the live costing tab, i.e. the one whose price matches the contract):</w:t>
+        <w:t>At the next 07:30 run (or straight away with  python -m bhf.setup_projects  on the filing PC) the app sets the project up from the costing, exactly as costed:</w:t>
       </w:r>
     </w:p>
     <w:tbl>
@@ -1841,7 +1517,7 @@
                 <w:color w:val="222222"/>
                 <w:sz w:val="17"/>
               </w:rPr>
-              <w:t>One outgoing forecast line: item, supplier and extended cost as costed; section and description in Notes; Cost Type from the item (equipment, freight, install, contingency...).</w:t>
+              <w:t>One outgoing forecast line: item, supplier and extended cost as costed; section and description in Notes.</w:t>
             </w:r>
           </w:p>
         </w:tc>
@@ -1899,7 +1575,7 @@
                 <w:color w:val="222222"/>
                 <w:sz w:val="17"/>
               </w:rPr>
-              <w:t>Internal Labour on the Projects row (BHF time, not cash out).</w:t>
+              <w:t>Internal Labour (BHF time, not cash out).</w:t>
             </w:r>
           </w:p>
         </w:tc>
@@ -1928,7 +1604,7 @@
                 <w:color w:val="222222"/>
                 <w:sz w:val="17"/>
               </w:rPr>
-              <w:t>Sales order total in NetSuite (else the costing's bid price)</w:t>
+              <w:t>Sales order total in NetSuite, else the costing's bid price</w:t>
             </w:r>
           </w:p>
         </w:tc>
@@ -1955,7 +1631,7 @@
                 <w:color w:val="222222"/>
                 <w:sz w:val="17"/>
               </w:rPr>
-              <w:t>Contract Value, and the incoming "Main contract" line.</w:t>
+              <w:t>Contract Value and the incoming "Main contract" line.</w:t>
             </w:r>
           </w:p>
         </w:tc>
@@ -1985,7 +1661,7 @@
                 <w:color w:val="222222"/>
                 <w:sz w:val="17"/>
               </w:rPr>
-              <w:t>NetSuite job, SharePoint folder</w:t>
+              <w:t>The project code</w:t>
             </w:r>
           </w:p>
         </w:tc>
@@ -2013,12 +1689,27 @@
                 <w:color w:val="222222"/>
                 <w:sz w:val="17"/>
               </w:rPr>
-              <w:t>The Projects row (code, name, job ID, Live, folder) and the Smartsheet project folder copied from the template.</w:t>
+              <w:t>The NetSuite job, found by its code. If accounts have not raised a document on it yet, it links itself at a later run.</w:t>
             </w:r>
           </w:p>
         </w:tc>
       </w:tr>
     </w:tbl>
+    <w:p>
+      <w:pPr>
+        <w:spacing w:before="0" w:after="100" w:line="250" w:lineRule="auto"/>
+      </w:pPr>
+      <w:r>
+        <w:rPr>
+          <w:rFonts w:ascii="Aptos" w:hAnsi="Aptos" w:cs="Aptos"/>
+          <w:b w:val="0"/>
+          <w:i w:val="0"/>
+          <w:color w:val="222222"/>
+          <w:sz w:val="21"/>
+        </w:rPr>
+        <w:t>Then, within two working days, the PM opens the project on the dashboard (it shows "New project" under Needs attention): checks the lines, adds the customer PO number and payment milestones on Main contract, sets the P&amp;L start month and total timeline, and acknowledges it. Accounts code every document to the NetSuite job (section 5) and, for a new customer, create its Unearned Income and WIP accounts.</w:t>
+      </w:r>
+    </w:p>
     <w:p>
       <w:pPr>
         <w:spacing w:before="0" w:after="100" w:line="250" w:lineRule="auto"/>
@@ -2031,7 +1722,7 @@
           <w:color w:val="222222"/>
           <w:sz w:val="21"/>
         </w:rPr>
-        <w:t>Safeguard: All live projects lists any NetSuite job with recent documents that is not set up yet. A new job waits there until its SharePoint folder exists. Older jobs with new activity (a service order on a finished job) and jobs not to track (R&amp;D) are never set up automatically: add them by hand, or with Status Closed to stop them showing.</w:t>
+        <w:t>Safeguard: All live projects lists any NetSuite job with recent documents that has no project card yet.</w:t>
       </w:r>
     </w:p>
     <w:p>

</xml_diff>

<commit_message>
Start-up is one step: the project's Smartsheet folder with the costing attached (SharePoint 0.3 costing as fallback); NetSuite not needed to start; job linked later and the sales order replaces the bid price; card name picks the right costing tab; SOP section 4 rewritten
Co-Authored-By: Claude Opus 5.5 <noreply@anthropic.com>
</commit_message>
<xml_diff>
--- a/docs/BHF Project Cashflow SOP.docx
+++ b/docs/BHF Project Cashflow SOP.docx
@@ -693,7 +693,7 @@
                 <w:color w:val="222222"/>
                 <w:sz w:val="17"/>
               </w:rPr>
-              <w:t>Files new PO, bill, invoice, expense and stock PDFs into the project's SharePoint folders.</w:t>
+              <w:t>Files new PO, bill, invoice, expense and stock PDFs into the project's SharePoint folders. Bills are filed as a one-page BHF record of the NetSuite bill.</w:t>
             </w:r>
           </w:p>
         </w:tc>
@@ -888,7 +888,7 @@
                 <w:color w:val="222222"/>
                 <w:sz w:val="17"/>
               </w:rPr>
-              <w:t>Creates the SharePoint folder and saves the costing at award (section 4); checks the set-up; keeps forecast lines, expected dates and customer milestones right; clears Needs attention weekly; sets the P&amp;L timeline.</w:t>
+              <w:t>Creates the project's Smartsheet folder with the costing attached at award (section 4); checks the set-up; keeps forecast lines, expected dates and customer milestones right; clears Needs attention weekly; sets the P&amp;L timeline.</w:t>
             </w:r>
           </w:p>
         </w:tc>
@@ -1096,7 +1096,7 @@
           <w:color w:val="222222"/>
           <w:sz w:val="21"/>
         </w:rPr>
-        <w:t>A new project cashflow starts when these two things exist. Nothing else is needed.</w:t>
+        <w:t>One step, by the PM at award. Nothing else is needed, and NetSuite does not have to exist yet.</w:t>
       </w:r>
     </w:p>
     <w:tbl>
@@ -1255,7 +1255,7 @@
                 <w:color w:val="222222"/>
                 <w:sz w:val="17"/>
               </w:rPr>
-              <w:t>A project card in Smartsheet: the job's folder in 3. BHF Systems / 2. Contracted, copied from "BHF Project Contracted Template" and named "BHF26xxx Project name" (or a row in the Projects sheet).</w:t>
+              <w:t>The job's folder in Smartsheet: copy "BHF Project Contracted Template" into 3. BHF Systems / 2. Contracted, name it "BHF26xxx Project name", and attach the costing workbook (paperclip) to any sheet in it.</w:t>
             </w:r>
           </w:p>
         </w:tc>
@@ -1269,92 +1269,6 @@
               <w:end w:w="70" w:type="dxa"/>
             </w:tcMar>
             <w:vAlign w:val="top"/>
-          </w:tcPr>
-          <w:p>
-            <w:pPr>
-              <w:spacing w:after="0" w:line="240" w:lineRule="auto"/>
-            </w:pPr>
-            <w:r>
-              <w:rPr>
-                <w:rFonts w:ascii="Aptos" w:hAnsi="Aptos" w:cs="Aptos"/>
-                <w:b w:val="0"/>
-                <w:i w:val="0"/>
-                <w:color w:val="222222"/>
-                <w:sz w:val="17"/>
-              </w:rPr>
-              <w:t>PM, at award</w:t>
-            </w:r>
-          </w:p>
-        </w:tc>
-      </w:tr>
-      <w:tr>
-        <w:tc>
-          <w:tcPr>
-            <w:tcW w:type="dxa" w:w="567"/>
-            <w:tcMar>
-              <w:top w:w="26" w:type="dxa"/>
-              <w:bottom w:w="26" w:type="dxa"/>
-              <w:start w:w="70" w:type="dxa"/>
-              <w:end w:w="70" w:type="dxa"/>
-            </w:tcMar>
-            <w:vAlign w:val="top"/>
-            <w:shd w:val="clear" w:color="auto" w:fill="EEF3FA"/>
-          </w:tcPr>
-          <w:p>
-            <w:pPr>
-              <w:spacing w:after="0" w:line="240" w:lineRule="auto"/>
-            </w:pPr>
-            <w:r>
-              <w:rPr>
-                <w:rFonts w:ascii="Aptos" w:hAnsi="Aptos" w:cs="Aptos"/>
-                <w:b/>
-                <w:i w:val="0"/>
-                <w:color w:val="222222"/>
-                <w:sz w:val="17"/>
-              </w:rPr>
-              <w:t>2</w:t>
-            </w:r>
-          </w:p>
-        </w:tc>
-        <w:tc>
-          <w:tcPr>
-            <w:tcW w:type="dxa" w:w="7597"/>
-            <w:tcMar>
-              <w:top w:w="26" w:type="dxa"/>
-              <w:bottom w:w="26" w:type="dxa"/>
-              <w:start w:w="70" w:type="dxa"/>
-              <w:end w:w="70" w:type="dxa"/>
-            </w:tcMar>
-            <w:vAlign w:val="top"/>
-            <w:shd w:val="clear" w:color="auto" w:fill="EEF3FA"/>
-          </w:tcPr>
-          <w:p>
-            <w:pPr>
-              <w:spacing w:after="0" w:line="240" w:lineRule="auto"/>
-            </w:pPr>
-            <w:r>
-              <w:rPr>
-                <w:rFonts w:ascii="Aptos" w:hAnsi="Aptos" w:cs="Aptos"/>
-                <w:b w:val="0"/>
-                <w:i w:val="0"/>
-                <w:color w:val="222222"/>
-                <w:sz w:val="17"/>
-              </w:rPr>
-              <w:t>The job's SharePoint folder in 2.0 Projects Contracted with the same code, and the costing saved in 1.0 Working Folder / 0.3 Costing &amp; Cashflow.</w:t>
-            </w:r>
-          </w:p>
-        </w:tc>
-        <w:tc>
-          <w:tcPr>
-            <w:tcW w:type="dxa" w:w="1928"/>
-            <w:tcMar>
-              <w:top w:w="26" w:type="dxa"/>
-              <w:bottom w:w="26" w:type="dxa"/>
-              <w:start w:w="70" w:type="dxa"/>
-              <w:end w:w="70" w:type="dxa"/>
-            </w:tcMar>
-            <w:vAlign w:val="top"/>
-            <w:shd w:val="clear" w:color="auto" w:fill="EEF3FA"/>
           </w:tcPr>
           <w:p>
             <w:pPr>
@@ -1386,7 +1300,7 @@
           <w:color w:val="222222"/>
           <w:sz w:val="21"/>
         </w:rPr>
-        <w:t>At the next 07:30 run (or straight away with  python -m bhf.setup_projects  on the filing PC) the app sets the project up from the costing, exactly as costed:</w:t>
+        <w:t>By the next morning (07:30 run, or straight away with  python -m bhf.setup_projects  on the filing PC) the app builds the projected cashflow from the costing, exactly as costed:</w:t>
       </w:r>
     </w:p>
     <w:tbl>
@@ -1604,7 +1518,7 @@
                 <w:color w:val="222222"/>
                 <w:sz w:val="17"/>
               </w:rPr>
-              <w:t>Sales order total in NetSuite, else the costing's bid price</w:t>
+              <w:t>The costing's bid price</w:t>
             </w:r>
           </w:p>
         </w:tc>
@@ -1632,64 +1546,6 @@
                 <w:sz w:val="17"/>
               </w:rPr>
               <w:t>Contract Value and the incoming "Main contract" line.</w:t>
-            </w:r>
-          </w:p>
-        </w:tc>
-      </w:tr>
-      <w:tr>
-        <w:tc>
-          <w:tcPr>
-            <w:tcW w:type="dxa" w:w="3969"/>
-            <w:tcMar>
-              <w:top w:w="26" w:type="dxa"/>
-              <w:bottom w:w="26" w:type="dxa"/>
-              <w:start w:w="70" w:type="dxa"/>
-              <w:end w:w="70" w:type="dxa"/>
-            </w:tcMar>
-            <w:vAlign w:val="top"/>
-            <w:shd w:val="clear" w:color="auto" w:fill="EEF3FA"/>
-          </w:tcPr>
-          <w:p>
-            <w:pPr>
-              <w:spacing w:after="0" w:line="240" w:lineRule="auto"/>
-            </w:pPr>
-            <w:r>
-              <w:rPr>
-                <w:rFonts w:ascii="Aptos" w:hAnsi="Aptos" w:cs="Aptos"/>
-                <w:b/>
-                <w:i w:val="0"/>
-                <w:color w:val="222222"/>
-                <w:sz w:val="17"/>
-              </w:rPr>
-              <w:t>The project code</w:t>
-            </w:r>
-          </w:p>
-        </w:tc>
-        <w:tc>
-          <w:tcPr>
-            <w:tcW w:type="dxa" w:w="6123"/>
-            <w:tcMar>
-              <w:top w:w="26" w:type="dxa"/>
-              <w:bottom w:w="26" w:type="dxa"/>
-              <w:start w:w="70" w:type="dxa"/>
-              <w:end w:w="70" w:type="dxa"/>
-            </w:tcMar>
-            <w:vAlign w:val="top"/>
-            <w:shd w:val="clear" w:color="auto" w:fill="EEF3FA"/>
-          </w:tcPr>
-          <w:p>
-            <w:pPr>
-              <w:spacing w:after="0" w:line="240" w:lineRule="auto"/>
-            </w:pPr>
-            <w:r>
-              <w:rPr>
-                <w:rFonts w:ascii="Aptos" w:hAnsi="Aptos" w:cs="Aptos"/>
-                <w:b w:val="0"/>
-                <w:i w:val="0"/>
-                <w:color w:val="222222"/>
-                <w:sz w:val="17"/>
-              </w:rPr>
-              <w:t>The NetSuite job, found by its code. If accounts have not raised a document on it yet, it links itself at a later run.</w:t>
             </w:r>
           </w:p>
         </w:tc>
@@ -1707,7 +1563,22 @@
           <w:color w:val="222222"/>
           <w:sz w:val="21"/>
         </w:rPr>
-        <w:t>Then, within two working days, the PM opens the project on the dashboard (it shows "New project" under Needs attention): checks the lines, adds the customer PO number and payment milestones on Main contract, sets the P&amp;L start month and total timeline, and acknowledges it. Accounts code every document to the NetSuite job (section 5) and, for a new customer, create its Unearned Income and WIP accounts.</w:t>
+        <w:t>When accounts create the job in NetSuite and raise its first document, the app finds it by its code and links it. From then on POs, bills and invoices flow in, and once the sales order is raised its total replaces the bid price (unless the PM has already changed it).</w:t>
+      </w:r>
+    </w:p>
+    <w:p>
+      <w:pPr>
+        <w:spacing w:before="0" w:after="100" w:line="250" w:lineRule="auto"/>
+      </w:pPr>
+      <w:r>
+        <w:rPr>
+          <w:rFonts w:ascii="Aptos" w:hAnsi="Aptos" w:cs="Aptos"/>
+          <w:b w:val="0"/>
+          <w:i w:val="0"/>
+          <w:color w:val="222222"/>
+          <w:sz w:val="21"/>
+        </w:rPr>
+        <w:t>The PM then checks the project on the dashboard (it shows "New project" under Needs attention): the lines, the customer PO number and payment milestones on Main contract, and the P&amp;L start month and total timeline, then acknowledges it. Accounts code every document to the job (section 5) and, for a new customer, create its Unearned Income and WIP accounts.</w:t>
       </w:r>
     </w:p>
     <w:p>
@@ -1722,7 +1593,7 @@
           <w:color w:val="222222"/>
           <w:sz w:val="21"/>
         </w:rPr>
-        <w:t>Safeguard: All live projects lists any NetSuite job with recent documents that has no project card yet.</w:t>
+        <w:t>A costing saved in the SharePoint job folder (1.0 Working Folder / 0.3 Costing &amp; Cashflow) is used if none is attached in Smartsheet. Safeguard: All live projects lists any NetSuite job with recent documents that has no Smartsheet folder yet.</w:t>
       </w:r>
     </w:p>
     <w:p>

</xml_diff>

<commit_message>
Start-up from either place: a new SharePoint job folder (made in the last 120 days) or a Smartsheet folder, with the costing in it; costing found anywhere in the SharePoint folder; SOP section 4 updated
Co-Authored-By: Claude Opus 5.5 <noreply@anthropic.com>
</commit_message>
<xml_diff>
--- a/docs/BHF Project Cashflow SOP.docx
+++ b/docs/BHF Project Cashflow SOP.docx
@@ -888,7 +888,7 @@
                 <w:color w:val="222222"/>
                 <w:sz w:val="17"/>
               </w:rPr>
-              <w:t>Creates the project's Smartsheet folder with the costing attached at award (section 4); checks the set-up; keeps forecast lines, expected dates and customer milestones right; clears Needs attention weekly; sets the P&amp;L timeline.</w:t>
+              <w:t>Creates the job folder (SharePoint or Smartsheet) with the costing in it at award (section 4); checks the set-up; keeps forecast lines, expected dates and customer milestones right; clears Needs attention weekly; sets the P&amp;L timeline.</w:t>
             </w:r>
           </w:p>
         </w:tc>
@@ -1096,7 +1096,7 @@
           <w:color w:val="222222"/>
           <w:sz w:val="21"/>
         </w:rPr>
-        <w:t>One step, by the PM at award. Nothing else is needed, and NetSuite does not have to exist yet.</w:t>
+        <w:t>One step, by the PM at award: a new job folder with the costing in it, in either place. Nothing else is needed, and NetSuite does not have to exist yet.</w:t>
       </w:r>
     </w:p>
     <w:tbl>
@@ -1122,7 +1122,7 @@
       <w:tr>
         <w:tc>
           <w:tcPr>
-            <w:tcW w:type="dxa" w:w="567"/>
+            <w:tcW w:type="dxa" w:w="1474"/>
             <w:shd w:val="clear" w:color="auto" w:fill="16324F"/>
             <w:tcMar>
               <w:top w:w="26" w:type="dxa"/>
@@ -1144,12 +1144,13 @@
                 <w:color w:val="FFFFFF"/>
                 <w:sz w:val="18"/>
               </w:rPr>
-            </w:r>
-          </w:p>
-        </w:tc>
-        <w:tc>
-          <w:tcPr>
-            <w:tcW w:type="dxa" w:w="7597"/>
+              <w:t>Either</w:t>
+            </w:r>
+          </w:p>
+        </w:tc>
+        <w:tc>
+          <w:tcPr>
+            <w:tcW w:type="dxa" w:w="6690"/>
             <w:shd w:val="clear" w:color="auto" w:fill="16324F"/>
             <w:tcMar>
               <w:top w:w="26" w:type="dxa"/>
@@ -1207,7 +1208,7 @@
       <w:tr>
         <w:tc>
           <w:tcPr>
-            <w:tcW w:type="dxa" w:w="567"/>
+            <w:tcW w:type="dxa" w:w="1474"/>
             <w:tcMar>
               <w:top w:w="26" w:type="dxa"/>
               <w:bottom w:w="26" w:type="dxa"/>
@@ -1228,13 +1229,13 @@
                 <w:color w:val="222222"/>
                 <w:sz w:val="17"/>
               </w:rPr>
-              <w:t>1</w:t>
-            </w:r>
-          </w:p>
-        </w:tc>
-        <w:tc>
-          <w:tcPr>
-            <w:tcW w:type="dxa" w:w="7597"/>
+              <w:t>SharePoint</w:t>
+            </w:r>
+          </w:p>
+        </w:tc>
+        <w:tc>
+          <w:tcPr>
+            <w:tcW w:type="dxa" w:w="6690"/>
             <w:tcMar>
               <w:top w:w="26" w:type="dxa"/>
               <w:bottom w:w="26" w:type="dxa"/>
@@ -1255,7 +1256,7 @@
                 <w:color w:val="222222"/>
                 <w:sz w:val="17"/>
               </w:rPr>
-              <w:t>The job's folder in Smartsheet: copy "BHF Project Contracted Template" into 3. BHF Systems / 2. Contracted, name it "BHF26xxx Project name", and attach the costing workbook (paperclip) to any sheet in it.</w:t>
+              <w:t>The job's folder in 6.0 Projects / 2.0 Projects Contracted, named "BHF26xxx Project name", with the costing saved in it (1.0 Working Folder / 0.3 Costing &amp; Cashflow, or anywhere in the folder).</w:t>
             </w:r>
           </w:p>
         </w:tc>
@@ -1269,6 +1270,92 @@
               <w:end w:w="70" w:type="dxa"/>
             </w:tcMar>
             <w:vAlign w:val="top"/>
+          </w:tcPr>
+          <w:p>
+            <w:pPr>
+              <w:spacing w:after="0" w:line="240" w:lineRule="auto"/>
+            </w:pPr>
+            <w:r>
+              <w:rPr>
+                <w:rFonts w:ascii="Aptos" w:hAnsi="Aptos" w:cs="Aptos"/>
+                <w:b w:val="0"/>
+                <w:i w:val="0"/>
+                <w:color w:val="222222"/>
+                <w:sz w:val="17"/>
+              </w:rPr>
+              <w:t>PM, at award</w:t>
+            </w:r>
+          </w:p>
+        </w:tc>
+      </w:tr>
+      <w:tr>
+        <w:tc>
+          <w:tcPr>
+            <w:tcW w:type="dxa" w:w="1474"/>
+            <w:tcMar>
+              <w:top w:w="26" w:type="dxa"/>
+              <w:bottom w:w="26" w:type="dxa"/>
+              <w:start w:w="70" w:type="dxa"/>
+              <w:end w:w="70" w:type="dxa"/>
+            </w:tcMar>
+            <w:vAlign w:val="top"/>
+            <w:shd w:val="clear" w:color="auto" w:fill="EEF3FA"/>
+          </w:tcPr>
+          <w:p>
+            <w:pPr>
+              <w:spacing w:after="0" w:line="240" w:lineRule="auto"/>
+            </w:pPr>
+            <w:r>
+              <w:rPr>
+                <w:rFonts w:ascii="Aptos" w:hAnsi="Aptos" w:cs="Aptos"/>
+                <w:b/>
+                <w:i w:val="0"/>
+                <w:color w:val="222222"/>
+                <w:sz w:val="17"/>
+              </w:rPr>
+              <w:t>Smartsheet</w:t>
+            </w:r>
+          </w:p>
+        </w:tc>
+        <w:tc>
+          <w:tcPr>
+            <w:tcW w:type="dxa" w:w="6690"/>
+            <w:tcMar>
+              <w:top w:w="26" w:type="dxa"/>
+              <w:bottom w:w="26" w:type="dxa"/>
+              <w:start w:w="70" w:type="dxa"/>
+              <w:end w:w="70" w:type="dxa"/>
+            </w:tcMar>
+            <w:vAlign w:val="top"/>
+            <w:shd w:val="clear" w:color="auto" w:fill="EEF3FA"/>
+          </w:tcPr>
+          <w:p>
+            <w:pPr>
+              <w:spacing w:after="0" w:line="240" w:lineRule="auto"/>
+            </w:pPr>
+            <w:r>
+              <w:rPr>
+                <w:rFonts w:ascii="Aptos" w:hAnsi="Aptos" w:cs="Aptos"/>
+                <w:b w:val="0"/>
+                <w:i w:val="0"/>
+                <w:color w:val="222222"/>
+                <w:sz w:val="17"/>
+              </w:rPr>
+              <w:t>The job's folder in 3. BHF Systems / 2. Contracted, copied from "BHF Project Contracted Template" and named "BHF26xxx Project name", with the costing workbook attached (paperclip) to any sheet in it.</w:t>
+            </w:r>
+          </w:p>
+        </w:tc>
+        <w:tc>
+          <w:tcPr>
+            <w:tcW w:type="dxa" w:w="1928"/>
+            <w:tcMar>
+              <w:top w:w="26" w:type="dxa"/>
+              <w:bottom w:w="26" w:type="dxa"/>
+              <w:start w:w="70" w:type="dxa"/>
+              <w:end w:w="70" w:type="dxa"/>
+            </w:tcMar>
+            <w:vAlign w:val="top"/>
+            <w:shd w:val="clear" w:color="auto" w:fill="EEF3FA"/>
           </w:tcPr>
           <w:p>
             <w:pPr>
@@ -1593,7 +1680,7 @@
           <w:color w:val="222222"/>
           <w:sz w:val="21"/>
         </w:rPr>
-        <w:t>A costing saved in the SharePoint job folder (1.0 Working Folder / 0.3 Costing &amp; Cashflow) is used if none is attached in Smartsheet. Safeguard: All live projects lists any NetSuite job with recent documents that has no Smartsheet folder yet.</w:t>
+        <w:t>Starting from SharePoint, the app copies the Smartsheet template folder for the job. Only SharePoint folders made in the last 120 days count, so old folders never set themselves up. Safeguard: All live projects lists any NetSuite job with recent documents that is not on the app yet.</w:t>
       </w:r>
     </w:p>
     <w:p>

</xml_diff>

<commit_message>
Filing task uses its own Python env (a Python update on the PC broke it 13-16/10) and logs FAILED lines; Render sync runs 07:00/13:00 Melbourne every day (the UTC 1-5 schedule skipped Monday mornings and ran Saturdays)
Co-Authored-By: Claude Opus 5.5 <noreply@anthropic.com>
</commit_message>
<xml_diff>
--- a/docs/BHF Project Cashflow SOP.docx
+++ b/docs/BHF Project Cashflow SOP.docx
@@ -383,7 +383,7 @@
                 <w:color w:val="222222"/>
                 <w:sz w:val="17"/>
               </w:rPr>
-              <w:t>07:00 and 13:00 weekdays</w:t>
+              <w:t>07:00 and 13:00 daily</w:t>
             </w:r>
           </w:p>
         </w:tc>
@@ -3576,7 +3576,7 @@
                 <w:color w:val="222222"/>
                 <w:sz w:val="17"/>
               </w:rPr>
-              <w:t>filing.log on the filing PC; the PC must be on and signed in.</w:t>
+              <w:t>filing.log on the filing PC (a FAILED line says why); the PC must be on and signed in.</w:t>
             </w:r>
           </w:p>
         </w:tc>

</xml_diff>